<commit_message>
feat(applications): add Skild AI Research Engineer application
Co-Authored-By: Claude Sonnet 4.6 <noreply@anthropic.com>
</commit_message>
<xml_diff>
--- a/Applications/20260412_Skild_AI_Application_Research_Engineer/Alexander-Nettekoven-Resume-Skild-AI-Research-Engineer.docx
+++ b/Applications/20260412_Skild_AI_Application_Research_Engineer/Alexander-Nettekoven-Resume-Skild-AI-Research-Engineer.docx
@@ -419,7 +419,31 @@
         <w:rPr>
           <w:sz w:val="22"/>
         </w:rPr>
-        <w:t>learning,</w:t>
+        <w:t>learning</w:t>
+      </w:r>
+      <w:r>
+        <w:rPr>
+          <w:sz w:val="22"/>
+        </w:rPr>
+        <w:t xml:space="preserve"> </w:t>
+      </w:r>
+      <w:r>
+        <w:rPr>
+          <w:sz w:val="22"/>
+        </w:rPr>
+        <w:t>for</w:t>
+      </w:r>
+      <w:r>
+        <w:rPr>
+          <w:sz w:val="22"/>
+        </w:rPr>
+        <w:t xml:space="preserve"> </w:t>
+      </w:r>
+      <w:r>
+        <w:rPr>
+          <w:sz w:val="22"/>
+        </w:rPr>
+        <w:t>manipulation,</w:t>
       </w:r>
       <w:r>
         <w:rPr>
@@ -466,20 +490,9 @@
       <w:r>
         <w:rPr>
           <w:sz w:val="22"/>
-        </w:rPr>
-        <w:t>full</w:t>
-      </w:r>
-      <w:r>
-        <w:rPr>
-          <w:sz w:val="22"/>
-        </w:rPr>
-        <w:t xml:space="preserve"> </w:t>
-      </w:r>
-      <w:r>
-        <w:rPr>
-          <w:sz w:val="22"/>
-        </w:rPr>
-        <w:t>stack</w:t>
+          <w:highlight w:val="yellow"/>
+        </w:rPr>
+        <w:t>full-stack</w:t>
       </w:r>
       <w:r>
         <w:rPr>
@@ -552,6 +565,55 @@
           <w:sz w:val="22"/>
           <w:highlight w:val="yellow"/>
         </w:rPr>
+        <w:t>novel,</w:t>
+      </w:r>
+      <w:r>
+        <w:rPr>
+          <w:sz w:val="22"/>
+        </w:rPr>
+        <w:t xml:space="preserve"> </w:t>
+      </w:r>
+      <w:r>
+        <w:rPr>
+          <w:sz w:val="22"/>
+          <w:highlight w:val="yellow"/>
+        </w:rPr>
+        <w:t>scalable</w:t>
+      </w:r>
+      <w:r>
+        <w:rPr>
+          <w:sz w:val="22"/>
+        </w:rPr>
+        <w:t xml:space="preserve"> </w:t>
+      </w:r>
+      <w:r>
+        <w:rPr>
+          <w:sz w:val="22"/>
+        </w:rPr>
+        <w:t>robotic</w:t>
+      </w:r>
+      <w:r>
+        <w:rPr>
+          <w:sz w:val="22"/>
+        </w:rPr>
+        <w:t xml:space="preserve"> </w:t>
+      </w:r>
+      <w:r>
+        <w:rPr>
+          <w:sz w:val="22"/>
+        </w:rPr>
+        <w:t>systems</w:t>
+      </w:r>
+      <w:r>
+        <w:rPr>
+          <w:sz w:val="22"/>
+        </w:rPr>
+        <w:t xml:space="preserve"> </w:t>
+      </w:r>
+      <w:r>
+        <w:rPr>
+          <w:sz w:val="22"/>
+        </w:rPr>
         <w:t>and</w:t>
       </w:r>
       <w:r>
@@ -563,69 +625,8 @@
       <w:r>
         <w:rPr>
           <w:sz w:val="22"/>
-          <w:highlight w:val="yellow"/>
-        </w:rPr>
-        <w:t>scaling</w:t>
-      </w:r>
-      <w:r>
-        <w:rPr>
-          <w:sz w:val="22"/>
-        </w:rPr>
-        <w:t xml:space="preserve"> </w:t>
-      </w:r>
-      <w:r>
-        <w:rPr>
-          <w:sz w:val="22"/>
-        </w:rPr>
-        <w:t>novel</w:t>
-      </w:r>
-      <w:r>
-        <w:rPr>
-          <w:sz w:val="22"/>
-        </w:rPr>
-        <w:t xml:space="preserve"> </w:t>
-      </w:r>
-      <w:r>
-        <w:rPr>
-          <w:sz w:val="22"/>
-        </w:rPr>
-        <w:t>robotic</w:t>
-      </w:r>
-      <w:r>
-        <w:rPr>
-          <w:sz w:val="22"/>
-        </w:rPr>
-        <w:t xml:space="preserve"> </w:t>
-      </w:r>
-      <w:r>
-        <w:rPr>
-          <w:sz w:val="22"/>
-        </w:rPr>
-        <w:t>systems</w:t>
-      </w:r>
-      <w:r>
-        <w:rPr>
-          <w:sz w:val="22"/>
-        </w:rPr>
-        <w:t xml:space="preserve"> </w:t>
-      </w:r>
-      <w:r>
-        <w:rPr>
-          <w:sz w:val="22"/>
-        </w:rPr>
-        <w:t>and</w:t>
-      </w:r>
-      <w:r>
-        <w:rPr>
-          <w:sz w:val="22"/>
-        </w:rPr>
-        <w:t xml:space="preserve"> </w:t>
-      </w:r>
-      <w:r>
-        <w:rPr>
-          <w:sz w:val="22"/>
-        </w:rPr>
-        <w:t>robot</w:t>
+        </w:rPr>
+        <w:t>multimodal</w:t>
       </w:r>
       <w:r>
         <w:rPr>
@@ -684,7 +685,6 @@
       <w:r>
         <w:rPr>
           <w:sz w:val="22"/>
-          <w:highlight w:val="yellow"/>
         </w:rPr>
         <w:t>environments.</w:t>
       </w:r>
@@ -867,10 +867,299 @@
       <w:r>
         <w:rPr>
           <w:sz w:val="22"/>
-          <w:szCs w:val="22"/>
-          <w:rtl w:val="0"/>
-        </w:rPr>
-        <w:t>Developing, fine-tuning, and deploying robot foundation models for manipulation tasks, including VLA models and World Action Models, under real-time deployment constraints:</w:t>
+        </w:rPr>
+        <w:t>Developing,</w:t>
+      </w:r>
+      <w:r>
+        <w:rPr>
+          <w:sz w:val="22"/>
+        </w:rPr>
+        <w:t xml:space="preserve"> </w:t>
+      </w:r>
+      <w:r>
+        <w:rPr>
+          <w:sz w:val="22"/>
+        </w:rPr>
+        <w:t>fine-tuning,</w:t>
+      </w:r>
+      <w:r>
+        <w:rPr>
+          <w:sz w:val="22"/>
+        </w:rPr>
+        <w:t xml:space="preserve"> </w:t>
+      </w:r>
+      <w:r>
+        <w:rPr>
+          <w:sz w:val="22"/>
+        </w:rPr>
+        <w:t>and</w:t>
+      </w:r>
+      <w:r>
+        <w:rPr>
+          <w:sz w:val="22"/>
+        </w:rPr>
+        <w:t xml:space="preserve"> </w:t>
+      </w:r>
+      <w:r>
+        <w:rPr>
+          <w:sz w:val="22"/>
+        </w:rPr>
+        <w:t>deploying</w:t>
+      </w:r>
+      <w:r>
+        <w:rPr>
+          <w:sz w:val="22"/>
+        </w:rPr>
+        <w:t xml:space="preserve"> </w:t>
+      </w:r>
+      <w:r>
+        <w:rPr>
+          <w:sz w:val="22"/>
+          <w:highlight w:val="yellow"/>
+        </w:rPr>
+        <w:t>scalable</w:t>
+      </w:r>
+      <w:r>
+        <w:rPr>
+          <w:sz w:val="22"/>
+        </w:rPr>
+        <w:t xml:space="preserve"> </w:t>
+      </w:r>
+      <w:r>
+        <w:rPr>
+          <w:sz w:val="22"/>
+        </w:rPr>
+        <w:t>robot</w:t>
+      </w:r>
+      <w:r>
+        <w:rPr>
+          <w:sz w:val="22"/>
+        </w:rPr>
+        <w:t xml:space="preserve"> </w:t>
+      </w:r>
+      <w:r>
+        <w:rPr>
+          <w:sz w:val="22"/>
+        </w:rPr>
+        <w:t>foundation</w:t>
+      </w:r>
+      <w:r>
+        <w:rPr>
+          <w:sz w:val="22"/>
+        </w:rPr>
+        <w:t xml:space="preserve"> </w:t>
+      </w:r>
+      <w:r>
+        <w:rPr>
+          <w:sz w:val="22"/>
+        </w:rPr>
+        <w:t>models</w:t>
+      </w:r>
+      <w:r>
+        <w:rPr>
+          <w:sz w:val="22"/>
+        </w:rPr>
+        <w:t xml:space="preserve"> </w:t>
+      </w:r>
+      <w:r>
+        <w:rPr>
+          <w:sz w:val="22"/>
+        </w:rPr>
+        <w:t>for</w:t>
+      </w:r>
+      <w:r>
+        <w:rPr>
+          <w:sz w:val="22"/>
+        </w:rPr>
+        <w:t xml:space="preserve"> </w:t>
+      </w:r>
+      <w:r>
+        <w:rPr>
+          <w:sz w:val="22"/>
+        </w:rPr>
+        <w:t>manipulation</w:t>
+      </w:r>
+      <w:r>
+        <w:rPr>
+          <w:sz w:val="22"/>
+        </w:rPr>
+        <w:t xml:space="preserve"> </w:t>
+      </w:r>
+      <w:r>
+        <w:rPr>
+          <w:sz w:val="22"/>
+        </w:rPr>
+        <w:t>tasks,</w:t>
+      </w:r>
+      <w:r>
+        <w:rPr>
+          <w:sz w:val="22"/>
+        </w:rPr>
+        <w:t xml:space="preserve"> </w:t>
+      </w:r>
+      <w:r>
+        <w:rPr>
+          <w:sz w:val="22"/>
+        </w:rPr>
+        <w:t>including</w:t>
+      </w:r>
+      <w:r>
+        <w:rPr>
+          <w:sz w:val="22"/>
+        </w:rPr>
+        <w:t xml:space="preserve"> </w:t>
+      </w:r>
+      <w:r>
+        <w:rPr>
+          <w:sz w:val="22"/>
+        </w:rPr>
+        <w:t>VLA</w:t>
+      </w:r>
+      <w:r>
+        <w:rPr>
+          <w:sz w:val="22"/>
+        </w:rPr>
+        <w:t xml:space="preserve"> </w:t>
+      </w:r>
+      <w:r>
+        <w:rPr>
+          <w:sz w:val="22"/>
+        </w:rPr>
+        <w:t>models</w:t>
+      </w:r>
+      <w:r>
+        <w:rPr>
+          <w:sz w:val="22"/>
+        </w:rPr>
+        <w:t xml:space="preserve"> </w:t>
+      </w:r>
+      <w:r>
+        <w:rPr>
+          <w:sz w:val="22"/>
+        </w:rPr>
+        <w:t>and</w:t>
+      </w:r>
+      <w:r>
+        <w:rPr>
+          <w:sz w:val="22"/>
+        </w:rPr>
+        <w:t xml:space="preserve"> </w:t>
+      </w:r>
+      <w:r>
+        <w:rPr>
+          <w:sz w:val="22"/>
+        </w:rPr>
+        <w:t>World</w:t>
+      </w:r>
+      <w:r>
+        <w:rPr>
+          <w:sz w:val="22"/>
+        </w:rPr>
+        <w:t xml:space="preserve"> </w:t>
+      </w:r>
+      <w:r>
+        <w:rPr>
+          <w:sz w:val="22"/>
+        </w:rPr>
+        <w:t>Action</w:t>
+      </w:r>
+      <w:r>
+        <w:rPr>
+          <w:sz w:val="22"/>
+        </w:rPr>
+        <w:t xml:space="preserve"> </w:t>
+      </w:r>
+      <w:r>
+        <w:rPr>
+          <w:sz w:val="22"/>
+        </w:rPr>
+        <w:t>Models,</w:t>
+      </w:r>
+      <w:r>
+        <w:rPr>
+          <w:sz w:val="22"/>
+        </w:rPr>
+        <w:t xml:space="preserve"> </w:t>
+      </w:r>
+      <w:r>
+        <w:rPr>
+          <w:sz w:val="22"/>
+          <w:highlight w:val="yellow"/>
+        </w:rPr>
+        <w:t>optimizing</w:t>
+      </w:r>
+      <w:r>
+        <w:rPr>
+          <w:sz w:val="22"/>
+        </w:rPr>
+        <w:t xml:space="preserve"> </w:t>
+      </w:r>
+      <w:r>
+        <w:rPr>
+          <w:sz w:val="22"/>
+          <w:highlight w:val="yellow"/>
+        </w:rPr>
+        <w:t>for</w:t>
+      </w:r>
+      <w:r>
+        <w:rPr>
+          <w:sz w:val="22"/>
+        </w:rPr>
+        <w:t xml:space="preserve"> </w:t>
+      </w:r>
+      <w:r>
+        <w:rPr>
+          <w:sz w:val="22"/>
+        </w:rPr>
+        <w:t>real-time</w:t>
+      </w:r>
+      <w:r>
+        <w:rPr>
+          <w:sz w:val="22"/>
+        </w:rPr>
+        <w:t xml:space="preserve"> </w:t>
+      </w:r>
+      <w:r>
+        <w:rPr>
+          <w:sz w:val="22"/>
+        </w:rPr>
+        <w:t>inference</w:t>
+      </w:r>
+      <w:r>
+        <w:rPr>
+          <w:sz w:val="22"/>
+        </w:rPr>
+        <w:t xml:space="preserve"> </w:t>
+      </w:r>
+      <w:r>
+        <w:rPr>
+          <w:sz w:val="22"/>
+        </w:rPr>
+        <w:t>and</w:t>
+      </w:r>
+      <w:r>
+        <w:rPr>
+          <w:sz w:val="22"/>
+        </w:rPr>
+        <w:t xml:space="preserve"> </w:t>
+      </w:r>
+      <w:r>
+        <w:rPr>
+          <w:sz w:val="22"/>
+        </w:rPr>
+        <w:t>deployment</w:t>
+      </w:r>
+      <w:r>
+        <w:rPr>
+          <w:sz w:val="22"/>
+        </w:rPr>
+        <w:t xml:space="preserve"> </w:t>
+      </w:r>
+      <w:r>
+        <w:rPr>
+          <w:sz w:val="22"/>
+        </w:rPr>
+        <w:t>constraints:</w:t>
       </w:r>
     </w:p>
     <w:p>
@@ -909,378 +1198,10 @@
       <w:r>
         <w:rPr>
           <w:sz w:val="22"/>
-          <w:highlight w:val="yellow"/>
-        </w:rPr>
-        <w:t>Fine-tuning</w:t>
-      </w:r>
-      <w:r>
-        <w:rPr>
-          <w:sz w:val="22"/>
-        </w:rPr>
-        <w:t xml:space="preserve"> </w:t>
-      </w:r>
-      <w:r>
-        <w:rPr>
-          <w:sz w:val="22"/>
-        </w:rPr>
-        <w:t>and</w:t>
-      </w:r>
-      <w:r>
-        <w:rPr>
-          <w:sz w:val="22"/>
-        </w:rPr>
-        <w:t xml:space="preserve"> </w:t>
-      </w:r>
-      <w:r>
-        <w:rPr>
-          <w:sz w:val="22"/>
-        </w:rPr>
-        <w:t>evaluating</w:t>
-      </w:r>
-      <w:r>
-        <w:rPr>
-          <w:sz w:val="22"/>
-        </w:rPr>
-        <w:t xml:space="preserve"> </w:t>
-      </w:r>
-      <w:r>
-        <w:rPr>
-          <w:sz w:val="22"/>
-        </w:rPr>
-        <w:t>DreamZero,</w:t>
-      </w:r>
-      <w:r>
-        <w:rPr>
-          <w:sz w:val="22"/>
-        </w:rPr>
-        <w:t xml:space="preserve"> </w:t>
-      </w:r>
-      <w:r>
-        <w:rPr>
-          <w:sz w:val="22"/>
-        </w:rPr>
-        <w:t>pi0.5,</w:t>
-      </w:r>
-      <w:r>
-        <w:rPr>
-          <w:sz w:val="22"/>
-        </w:rPr>
-        <w:t xml:space="preserve"> </w:t>
-      </w:r>
-      <w:r>
-        <w:rPr>
-          <w:sz w:val="22"/>
-        </w:rPr>
-        <w:t>SmolVLA,</w:t>
-      </w:r>
-      <w:r>
-        <w:rPr>
-          <w:sz w:val="22"/>
-        </w:rPr>
-        <w:t xml:space="preserve"> </w:t>
-      </w:r>
-      <w:r>
-        <w:rPr>
-          <w:sz w:val="22"/>
-        </w:rPr>
-        <w:t>and</w:t>
-      </w:r>
-      <w:r>
-        <w:rPr>
-          <w:sz w:val="22"/>
-        </w:rPr>
-        <w:t xml:space="preserve"> </w:t>
-      </w:r>
-      <w:r>
-        <w:rPr>
-          <w:sz w:val="22"/>
-        </w:rPr>
-        <w:t>ACT</w:t>
-      </w:r>
-      <w:r>
-        <w:rPr>
-          <w:sz w:val="22"/>
-        </w:rPr>
-        <w:t xml:space="preserve"> </w:t>
-      </w:r>
-      <w:r>
-        <w:rPr>
-          <w:sz w:val="22"/>
-        </w:rPr>
-        <w:t>on</w:t>
-      </w:r>
-      <w:r>
-        <w:rPr>
-          <w:sz w:val="22"/>
-        </w:rPr>
-        <w:t xml:space="preserve"> </w:t>
-      </w:r>
-      <w:r>
-        <w:rPr>
-          <w:sz w:val="22"/>
-        </w:rPr>
-        <w:t>pick-and-place</w:t>
-      </w:r>
-      <w:r>
-        <w:rPr>
-          <w:sz w:val="22"/>
-        </w:rPr>
-        <w:t xml:space="preserve"> </w:t>
-      </w:r>
-      <w:r>
-        <w:rPr>
-          <w:sz w:val="22"/>
-        </w:rPr>
-        <w:t>(&gt;90%</w:t>
-      </w:r>
-      <w:r>
-        <w:rPr>
-          <w:sz w:val="22"/>
-        </w:rPr>
-        <w:t xml:space="preserve"> </w:t>
-      </w:r>
-      <w:r>
-        <w:rPr>
-          <w:sz w:val="22"/>
-        </w:rPr>
-        <w:t>success</w:t>
-      </w:r>
-      <w:r>
-        <w:rPr>
-          <w:sz w:val="22"/>
-        </w:rPr>
-        <w:t xml:space="preserve"> </w:t>
-      </w:r>
-      <w:r>
-        <w:rPr>
-          <w:sz w:val="22"/>
-        </w:rPr>
-        <w:t>rate)</w:t>
-      </w:r>
-      <w:r>
-        <w:rPr>
-          <w:sz w:val="22"/>
-        </w:rPr>
-        <w:t xml:space="preserve"> </w:t>
-      </w:r>
-      <w:r>
-        <w:rPr>
-          <w:sz w:val="22"/>
-        </w:rPr>
-        <w:t>and</w:t>
-      </w:r>
-      <w:r>
-        <w:rPr>
-          <w:sz w:val="22"/>
-        </w:rPr>
-        <w:t xml:space="preserve"> </w:t>
-      </w:r>
-      <w:r>
-        <w:rPr>
-          <w:sz w:val="22"/>
-        </w:rPr>
-        <w:t>household</w:t>
-      </w:r>
-      <w:r>
-        <w:rPr>
-          <w:sz w:val="22"/>
-        </w:rPr>
-        <w:t xml:space="preserve"> </w:t>
-      </w:r>
-      <w:r>
-        <w:rPr>
-          <w:sz w:val="22"/>
-        </w:rPr>
-        <w:t>cleaning</w:t>
-      </w:r>
-      <w:r>
-        <w:rPr>
-          <w:sz w:val="22"/>
-        </w:rPr>
-        <w:t xml:space="preserve"> </w:t>
-      </w:r>
-      <w:r>
-        <w:rPr>
-          <w:sz w:val="22"/>
-        </w:rPr>
-        <w:t>tasks</w:t>
-      </w:r>
-      <w:r>
-        <w:rPr>
-          <w:sz w:val="22"/>
-        </w:rPr>
-        <w:t xml:space="preserve"> </w:t>
-      </w:r>
-      <w:r>
-        <w:rPr>
-          <w:sz w:val="22"/>
-        </w:rPr>
-        <w:t>across</w:t>
-      </w:r>
-      <w:r>
-        <w:rPr>
-          <w:sz w:val="22"/>
-        </w:rPr>
-        <w:t xml:space="preserve"> </w:t>
-      </w:r>
-      <w:r>
-        <w:rPr>
-          <w:sz w:val="22"/>
-        </w:rPr>
-        <w:t>simulation</w:t>
-      </w:r>
-      <w:r>
-        <w:rPr>
-          <w:sz w:val="22"/>
-        </w:rPr>
-        <w:t xml:space="preserve"> </w:t>
-      </w:r>
-      <w:r>
-        <w:rPr>
-          <w:sz w:val="22"/>
-        </w:rPr>
-        <w:t>and</w:t>
-      </w:r>
-      <w:r>
-        <w:rPr>
-          <w:sz w:val="22"/>
-        </w:rPr>
-        <w:t xml:space="preserve"> </w:t>
-      </w:r>
-      <w:r>
-        <w:rPr>
-          <w:sz w:val="22"/>
-        </w:rPr>
-        <w:t>real-world</w:t>
-      </w:r>
-      <w:r>
-        <w:rPr>
-          <w:sz w:val="22"/>
-        </w:rPr>
-        <w:t xml:space="preserve"> </w:t>
-      </w:r>
-      <w:r>
-        <w:rPr>
-          <w:sz w:val="22"/>
-        </w:rPr>
-        <w:t>manipulation</w:t>
-      </w:r>
-      <w:r>
-        <w:rPr>
-          <w:sz w:val="22"/>
-        </w:rPr>
-        <w:t xml:space="preserve"> </w:t>
-      </w:r>
-      <w:r>
-        <w:rPr>
-          <w:sz w:val="22"/>
-          <w:highlight w:val="yellow"/>
-        </w:rPr>
-        <w:t>settings;</w:t>
-      </w:r>
-      <w:r>
-        <w:rPr>
-          <w:sz w:val="22"/>
-        </w:rPr>
-        <w:t xml:space="preserve"> </w:t>
-      </w:r>
-      <w:r>
-        <w:rPr>
-          <w:sz w:val="22"/>
-          <w:highlight w:val="yellow"/>
-        </w:rPr>
-        <w:t>managed</w:t>
-      </w:r>
-      <w:r>
-        <w:rPr>
-          <w:sz w:val="22"/>
-        </w:rPr>
-        <w:t xml:space="preserve"> </w:t>
-      </w:r>
-      <w:r>
-        <w:rPr>
-          <w:sz w:val="22"/>
-          <w:highlight w:val="yellow"/>
-        </w:rPr>
-        <w:t>data</w:t>
-      </w:r>
-      <w:r>
-        <w:rPr>
-          <w:sz w:val="22"/>
-        </w:rPr>
-        <w:t xml:space="preserve"> </w:t>
-      </w:r>
-      <w:r>
-        <w:rPr>
-          <w:sz w:val="22"/>
-          <w:highlight w:val="yellow"/>
-        </w:rPr>
-        <w:t>curation</w:t>
-      </w:r>
-      <w:r>
-        <w:rPr>
-          <w:sz w:val="22"/>
-        </w:rPr>
-        <w:t xml:space="preserve"> </w:t>
-      </w:r>
-      <w:r>
-        <w:rPr>
-          <w:sz w:val="22"/>
-          <w:highlight w:val="yellow"/>
-        </w:rPr>
-        <w:t>pipelines</w:t>
-      </w:r>
-      <w:r>
-        <w:rPr>
-          <w:sz w:val="22"/>
-        </w:rPr>
-        <w:t xml:space="preserve"> </w:t>
-      </w:r>
-      <w:r>
-        <w:rPr>
-          <w:sz w:val="22"/>
-          <w:highlight w:val="yellow"/>
-        </w:rPr>
-        <w:t>and</w:t>
-      </w:r>
-      <w:r>
-        <w:rPr>
-          <w:sz w:val="22"/>
-        </w:rPr>
-        <w:t xml:space="preserve"> </w:t>
-      </w:r>
-      <w:r>
-        <w:rPr>
-          <w:sz w:val="22"/>
-          <w:highlight w:val="yellow"/>
-        </w:rPr>
-        <w:t>large-scale</w:t>
-      </w:r>
-      <w:r>
-        <w:rPr>
-          <w:sz w:val="22"/>
-        </w:rPr>
-        <w:t xml:space="preserve"> </w:t>
-      </w:r>
-      <w:r>
-        <w:rPr>
-          <w:sz w:val="22"/>
-          <w:highlight w:val="yellow"/>
-        </w:rPr>
-        <w:t>training</w:t>
-      </w:r>
-      <w:r>
-        <w:rPr>
-          <w:sz w:val="22"/>
-        </w:rPr>
-        <w:t xml:space="preserve"> </w:t>
-      </w:r>
-      <w:r>
-        <w:rPr>
-          <w:sz w:val="22"/>
-          <w:highlight w:val="yellow"/>
-        </w:rPr>
-        <w:t>runs</w:t>
+          <w:szCs w:val="22"/>
+          <w:rtl w:val="0"/>
+        </w:rPr>
+        <w:t>Fine-tuning and evaluating DreamZero, pi0.5, SmolVLA, and ACT on pick-and-place (&gt;90% success rate) and household cleaning tasks across simulation and real-world manipulation settings</w:t>
       </w:r>
     </w:p>
     <w:p>
@@ -1790,10 +1711,300 @@
       <w:r>
         <w:rPr>
           <w:sz w:val="22"/>
-          <w:szCs w:val="22"/>
-          <w:rtl w:val="0"/>
-        </w:rPr>
-        <w:t>Developed novel robotic systems and algorithms via deep learning, sim-to-real transfer, and end-to-end system design in collaboration with Caltech, UC Berkeley, Northeastern, and RPI:</w:t>
+        </w:rPr>
+        <w:t>Developed</w:t>
+      </w:r>
+      <w:r>
+        <w:rPr>
+          <w:sz w:val="22"/>
+        </w:rPr>
+        <w:t xml:space="preserve"> </w:t>
+      </w:r>
+      <w:r>
+        <w:rPr>
+          <w:sz w:val="22"/>
+        </w:rPr>
+        <w:t>novel</w:t>
+      </w:r>
+      <w:r>
+        <w:rPr>
+          <w:sz w:val="22"/>
+        </w:rPr>
+        <w:t xml:space="preserve"> </w:t>
+      </w:r>
+      <w:r>
+        <w:rPr>
+          <w:sz w:val="22"/>
+        </w:rPr>
+        <w:t>robotic</w:t>
+      </w:r>
+      <w:r>
+        <w:rPr>
+          <w:sz w:val="22"/>
+        </w:rPr>
+        <w:t xml:space="preserve"> </w:t>
+      </w:r>
+      <w:r>
+        <w:rPr>
+          <w:sz w:val="22"/>
+        </w:rPr>
+        <w:t>systems</w:t>
+      </w:r>
+      <w:r>
+        <w:rPr>
+          <w:sz w:val="22"/>
+        </w:rPr>
+        <w:t xml:space="preserve"> </w:t>
+      </w:r>
+      <w:r>
+        <w:rPr>
+          <w:sz w:val="22"/>
+        </w:rPr>
+        <w:t>and</w:t>
+      </w:r>
+      <w:r>
+        <w:rPr>
+          <w:sz w:val="22"/>
+        </w:rPr>
+        <w:t xml:space="preserve"> </w:t>
+      </w:r>
+      <w:r>
+        <w:rPr>
+          <w:sz w:val="22"/>
+        </w:rPr>
+        <w:t>algorithms</w:t>
+      </w:r>
+      <w:r>
+        <w:rPr>
+          <w:sz w:val="22"/>
+        </w:rPr>
+        <w:t xml:space="preserve"> </w:t>
+      </w:r>
+      <w:r>
+        <w:rPr>
+          <w:sz w:val="22"/>
+        </w:rPr>
+        <w:t>via</w:t>
+      </w:r>
+      <w:r>
+        <w:rPr>
+          <w:sz w:val="22"/>
+        </w:rPr>
+        <w:t xml:space="preserve"> </w:t>
+      </w:r>
+      <w:r>
+        <w:rPr>
+          <w:sz w:val="22"/>
+        </w:rPr>
+        <w:t>deep</w:t>
+      </w:r>
+      <w:r>
+        <w:rPr>
+          <w:sz w:val="22"/>
+        </w:rPr>
+        <w:t xml:space="preserve"> </w:t>
+      </w:r>
+      <w:r>
+        <w:rPr>
+          <w:sz w:val="22"/>
+        </w:rPr>
+        <w:t>learning,</w:t>
+      </w:r>
+      <w:r>
+        <w:rPr>
+          <w:sz w:val="22"/>
+        </w:rPr>
+        <w:t xml:space="preserve"> </w:t>
+      </w:r>
+      <w:r>
+        <w:rPr>
+          <w:sz w:val="22"/>
+        </w:rPr>
+        <w:t>sim-to-real</w:t>
+      </w:r>
+      <w:r>
+        <w:rPr>
+          <w:sz w:val="22"/>
+        </w:rPr>
+        <w:t xml:space="preserve"> </w:t>
+      </w:r>
+      <w:r>
+        <w:rPr>
+          <w:sz w:val="22"/>
+        </w:rPr>
+        <w:t>transfer,</w:t>
+      </w:r>
+      <w:r>
+        <w:rPr>
+          <w:sz w:val="22"/>
+        </w:rPr>
+        <w:t xml:space="preserve"> </w:t>
+      </w:r>
+      <w:r>
+        <w:rPr>
+          <w:sz w:val="22"/>
+        </w:rPr>
+        <w:t>and</w:t>
+      </w:r>
+      <w:r>
+        <w:rPr>
+          <w:sz w:val="22"/>
+        </w:rPr>
+        <w:t xml:space="preserve"> </w:t>
+      </w:r>
+      <w:r>
+        <w:rPr>
+          <w:sz w:val="22"/>
+        </w:rPr>
+        <w:t>end-to-end</w:t>
+      </w:r>
+      <w:r>
+        <w:rPr>
+          <w:sz w:val="22"/>
+        </w:rPr>
+        <w:t xml:space="preserve"> </w:t>
+      </w:r>
+      <w:r>
+        <w:rPr>
+          <w:sz w:val="22"/>
+        </w:rPr>
+        <w:t>system</w:t>
+      </w:r>
+      <w:r>
+        <w:rPr>
+          <w:sz w:val="22"/>
+        </w:rPr>
+        <w:t xml:space="preserve"> </w:t>
+      </w:r>
+      <w:r>
+        <w:rPr>
+          <w:sz w:val="22"/>
+        </w:rPr>
+        <w:t>design</w:t>
+      </w:r>
+      <w:r>
+        <w:rPr>
+          <w:sz w:val="22"/>
+        </w:rPr>
+        <w:t xml:space="preserve"> </w:t>
+      </w:r>
+      <w:r>
+        <w:rPr>
+          <w:sz w:val="22"/>
+          <w:highlight w:val="yellow"/>
+        </w:rPr>
+        <w:t>across</w:t>
+      </w:r>
+      <w:r>
+        <w:rPr>
+          <w:sz w:val="22"/>
+        </w:rPr>
+        <w:t xml:space="preserve"> </w:t>
+      </w:r>
+      <w:r>
+        <w:rPr>
+          <w:sz w:val="22"/>
+          <w:highlight w:val="yellow"/>
+        </w:rPr>
+        <w:t>multidisciplinary</w:t>
+      </w:r>
+      <w:r>
+        <w:rPr>
+          <w:sz w:val="22"/>
+        </w:rPr>
+        <w:t xml:space="preserve"> </w:t>
+      </w:r>
+      <w:r>
+        <w:rPr>
+          <w:sz w:val="22"/>
+          <w:highlight w:val="yellow"/>
+        </w:rPr>
+        <w:t>teams</w:t>
+      </w:r>
+      <w:r>
+        <w:rPr>
+          <w:sz w:val="22"/>
+        </w:rPr>
+        <w:t xml:space="preserve"> </w:t>
+      </w:r>
+      <w:r>
+        <w:rPr>
+          <w:sz w:val="22"/>
+          <w:highlight w:val="yellow"/>
+        </w:rPr>
+        <w:t>at</w:t>
+      </w:r>
+      <w:r>
+        <w:rPr>
+          <w:sz w:val="22"/>
+        </w:rPr>
+        <w:t xml:space="preserve"> </w:t>
+      </w:r>
+      <w:r>
+        <w:rPr>
+          <w:sz w:val="22"/>
+        </w:rPr>
+        <w:t>Caltech,</w:t>
+      </w:r>
+      <w:r>
+        <w:rPr>
+          <w:sz w:val="22"/>
+        </w:rPr>
+        <w:t xml:space="preserve"> </w:t>
+      </w:r>
+      <w:r>
+        <w:rPr>
+          <w:sz w:val="22"/>
+        </w:rPr>
+        <w:t>UC</w:t>
+      </w:r>
+      <w:r>
+        <w:rPr>
+          <w:sz w:val="22"/>
+        </w:rPr>
+        <w:t xml:space="preserve"> </w:t>
+      </w:r>
+      <w:r>
+        <w:rPr>
+          <w:sz w:val="22"/>
+        </w:rPr>
+        <w:t>Berkeley,</w:t>
+      </w:r>
+      <w:r>
+        <w:rPr>
+          <w:sz w:val="22"/>
+        </w:rPr>
+        <w:t xml:space="preserve"> </w:t>
+      </w:r>
+      <w:r>
+        <w:rPr>
+          <w:sz w:val="22"/>
+        </w:rPr>
+        <w:t>Northeastern,</w:t>
+      </w:r>
+      <w:r>
+        <w:rPr>
+          <w:sz w:val="22"/>
+        </w:rPr>
+        <w:t xml:space="preserve"> </w:t>
+      </w:r>
+      <w:r>
+        <w:rPr>
+          <w:sz w:val="22"/>
+        </w:rPr>
+        <w:t>and</w:t>
+      </w:r>
+      <w:r>
+        <w:rPr>
+          <w:sz w:val="22"/>
+        </w:rPr>
+        <w:t xml:space="preserve"> </w:t>
+      </w:r>
+      <w:r>
+        <w:rPr>
+          <w:sz w:val="22"/>
+        </w:rPr>
+        <w:t>RPI:</w:t>
       </w:r>
     </w:p>
     <w:p>
@@ -2389,9 +2600,57 @@
       <w:r>
         <w:rPr>
           <w:sz w:val="22"/>
+        </w:rPr>
+        <w:t>Bimanual</w:t>
+      </w:r>
+      <w:r>
+        <w:rPr>
+          <w:sz w:val="22"/>
+        </w:rPr>
+        <w:t xml:space="preserve"> </w:t>
+      </w:r>
+      <w:r>
+        <w:rPr>
+          <w:sz w:val="22"/>
+        </w:rPr>
+        <w:t>Manipulation,</w:t>
+      </w:r>
+      <w:r>
+        <w:rPr>
+          <w:sz w:val="22"/>
+        </w:rPr>
+        <w:t xml:space="preserve"> </w:t>
+      </w:r>
+      <w:r>
+        <w:rPr>
+          <w:sz w:val="22"/>
+        </w:rPr>
+        <w:t>Computer</w:t>
+      </w:r>
+      <w:r>
+        <w:rPr>
+          <w:sz w:val="22"/>
+        </w:rPr>
+        <w:t xml:space="preserve"> </w:t>
+      </w:r>
+      <w:r>
+        <w:rPr>
+          <w:sz w:val="22"/>
+        </w:rPr>
+        <w:t>Vision</w:t>
+      </w:r>
+      <w:r>
+        <w:rPr>
+          <w:sz w:val="22"/>
+        </w:rPr>
+        <w:t xml:space="preserve"> </w:t>
+      </w:r>
+      <w:r>
+        <w:rPr>
+          <w:sz w:val="22"/>
           <w:highlight w:val="yellow"/>
         </w:rPr>
-        <w:t>2D/3D</w:t>
+        <w:t>and</w:t>
       </w:r>
       <w:r>
         <w:rPr>
@@ -2405,43 +2664,6 @@
           <w:highlight w:val="yellow"/>
         </w:rPr>
         <w:t>Perception</w:t>
-      </w:r>
-      <w:r>
-        <w:rPr>
-          <w:sz w:val="22"/>
-        </w:rPr>
-        <w:t xml:space="preserve"> </w:t>
-      </w:r>
-      <w:r>
-        <w:rPr>
-          <w:sz w:val="22"/>
-          <w:highlight w:val="yellow"/>
-        </w:rPr>
-        <w:t>and</w:t>
-      </w:r>
-      <w:r>
-        <w:rPr>
-          <w:sz w:val="22"/>
-        </w:rPr>
-        <w:t xml:space="preserve"> </w:t>
-      </w:r>
-      <w:r>
-        <w:rPr>
-          <w:sz w:val="22"/>
-        </w:rPr>
-        <w:t>Computer</w:t>
-      </w:r>
-      <w:r>
-        <w:rPr>
-          <w:sz w:val="22"/>
-        </w:rPr>
-        <w:t xml:space="preserve"> </w:t>
-      </w:r>
-      <w:r>
-        <w:rPr>
-          <w:sz w:val="22"/>
-        </w:rPr>
-        <w:t>Vision</w:t>
       </w:r>
       <w:r>
         <w:rPr>
@@ -2636,336 +2858,10 @@
       <w:r>
         <w:rPr>
           <w:sz w:val="22"/>
-        </w:rPr>
-        <w:t>Programming</w:t>
-      </w:r>
-      <w:r>
-        <w:rPr>
-          <w:sz w:val="22"/>
-        </w:rPr>
-        <w:t xml:space="preserve"> </w:t>
-      </w:r>
-      <w:r>
-        <w:rPr>
-          <w:sz w:val="22"/>
-        </w:rPr>
-        <w:t>&amp;</w:t>
-      </w:r>
-      <w:r>
-        <w:rPr>
-          <w:sz w:val="22"/>
-        </w:rPr>
-        <w:t xml:space="preserve"> </w:t>
-      </w:r>
-      <w:r>
-        <w:rPr>
-          <w:sz w:val="22"/>
-        </w:rPr>
-        <w:t>Tools:</w:t>
-      </w:r>
-      <w:r>
-        <w:rPr>
-          <w:sz w:val="22"/>
-        </w:rPr>
-        <w:t xml:space="preserve"> </w:t>
-      </w:r>
-      <w:r>
-        <w:rPr>
-          <w:sz w:val="22"/>
-        </w:rPr>
-        <w:t>Python,</w:t>
-      </w:r>
-      <w:r>
-        <w:rPr>
-          <w:sz w:val="22"/>
-        </w:rPr>
-        <w:t xml:space="preserve"> </w:t>
-      </w:r>
-      <w:r>
-        <w:rPr>
-          <w:sz w:val="22"/>
-        </w:rPr>
-        <w:t>C++,</w:t>
-      </w:r>
-      <w:r>
-        <w:rPr>
-          <w:sz w:val="22"/>
-        </w:rPr>
-        <w:t xml:space="preserve"> </w:t>
-      </w:r>
-      <w:r>
-        <w:rPr>
-          <w:sz w:val="22"/>
-        </w:rPr>
-        <w:t>PyTorch,</w:t>
-      </w:r>
-      <w:r>
-        <w:rPr>
-          <w:sz w:val="22"/>
-        </w:rPr>
-        <w:t xml:space="preserve"> </w:t>
-      </w:r>
-      <w:r>
-        <w:rPr>
-          <w:sz w:val="22"/>
-        </w:rPr>
-        <w:t>ROS2,</w:t>
-      </w:r>
-      <w:r>
-        <w:rPr>
-          <w:sz w:val="22"/>
-        </w:rPr>
-        <w:t xml:space="preserve"> </w:t>
-      </w:r>
-      <w:r>
-        <w:rPr>
-          <w:sz w:val="22"/>
-        </w:rPr>
-        <w:t>Isaac</w:t>
-      </w:r>
-      <w:r>
-        <w:rPr>
-          <w:sz w:val="22"/>
-        </w:rPr>
-        <w:t xml:space="preserve"> </w:t>
-      </w:r>
-      <w:r>
-        <w:rPr>
-          <w:sz w:val="22"/>
-        </w:rPr>
-        <w:t>Sim/Isaac</w:t>
-      </w:r>
-      <w:r>
-        <w:rPr>
-          <w:sz w:val="22"/>
-        </w:rPr>
-        <w:t xml:space="preserve"> </w:t>
-      </w:r>
-      <w:r>
-        <w:rPr>
-          <w:sz w:val="22"/>
-        </w:rPr>
-        <w:t>Lab</w:t>
-      </w:r>
-      <w:r>
-        <w:rPr>
-          <w:sz w:val="22"/>
-        </w:rPr>
-        <w:t xml:space="preserve"> </w:t>
-      </w:r>
-      <w:r>
-        <w:rPr>
-          <w:sz w:val="22"/>
-        </w:rPr>
-        <w:t>and</w:t>
-      </w:r>
-      <w:r>
-        <w:rPr>
-          <w:sz w:val="22"/>
-        </w:rPr>
-        <w:t xml:space="preserve"> </w:t>
-      </w:r>
-      <w:r>
-        <w:rPr>
-          <w:sz w:val="22"/>
-        </w:rPr>
-        <w:t>MuJoCo</w:t>
-      </w:r>
-      <w:r>
-        <w:rPr>
-          <w:sz w:val="22"/>
-        </w:rPr>
-        <w:t xml:space="preserve"> </w:t>
-      </w:r>
-      <w:r>
-        <w:rPr>
-          <w:sz w:val="22"/>
-        </w:rPr>
-        <w:t>(domain</w:t>
-      </w:r>
-      <w:r>
-        <w:rPr>
-          <w:sz w:val="22"/>
-        </w:rPr>
-        <w:t xml:space="preserve"> </w:t>
-      </w:r>
-      <w:r>
-        <w:rPr>
-          <w:sz w:val="22"/>
-        </w:rPr>
-        <w:t>randomization,</w:t>
-      </w:r>
-      <w:r>
-        <w:rPr>
-          <w:sz w:val="22"/>
-        </w:rPr>
-        <w:t xml:space="preserve"> </w:t>
-      </w:r>
-      <w:r>
-        <w:rPr>
-          <w:sz w:val="22"/>
-        </w:rPr>
-        <w:t>sim-to-real),</w:t>
-      </w:r>
-      <w:r>
-        <w:rPr>
-          <w:sz w:val="22"/>
-        </w:rPr>
-        <w:t xml:space="preserve"> </w:t>
-      </w:r>
-      <w:r>
-        <w:rPr>
-          <w:sz w:val="22"/>
-        </w:rPr>
-        <w:t>Firmware</w:t>
-      </w:r>
-      <w:r>
-        <w:rPr>
-          <w:sz w:val="22"/>
-        </w:rPr>
-        <w:t xml:space="preserve"> </w:t>
-      </w:r>
-      <w:r>
-        <w:rPr>
-          <w:sz w:val="22"/>
-        </w:rPr>
-        <w:t>&amp;</w:t>
-      </w:r>
-      <w:r>
-        <w:rPr>
-          <w:sz w:val="22"/>
-        </w:rPr>
-        <w:t xml:space="preserve"> </w:t>
-      </w:r>
-      <w:r>
-        <w:rPr>
-          <w:sz w:val="22"/>
-        </w:rPr>
-        <w:t>Embedded</w:t>
-      </w:r>
-      <w:r>
-        <w:rPr>
-          <w:sz w:val="22"/>
-        </w:rPr>
-        <w:t xml:space="preserve"> </w:t>
-      </w:r>
-      <w:r>
-        <w:rPr>
-          <w:sz w:val="22"/>
-        </w:rPr>
-        <w:t>Systems</w:t>
-      </w:r>
-      <w:r>
-        <w:rPr>
-          <w:sz w:val="22"/>
-        </w:rPr>
-        <w:t xml:space="preserve"> </w:t>
-      </w:r>
-      <w:r>
-        <w:rPr>
-          <w:sz w:val="22"/>
-        </w:rPr>
-        <w:t>(Arduino,</w:t>
-      </w:r>
-      <w:r>
-        <w:rPr>
-          <w:sz w:val="22"/>
-        </w:rPr>
-        <w:t xml:space="preserve"> </w:t>
-      </w:r>
-      <w:r>
-        <w:rPr>
-          <w:sz w:val="22"/>
-        </w:rPr>
-        <w:t>Raspberry</w:t>
-      </w:r>
-      <w:r>
-        <w:rPr>
-          <w:sz w:val="22"/>
-        </w:rPr>
-        <w:t xml:space="preserve"> </w:t>
-      </w:r>
-      <w:r>
-        <w:rPr>
-          <w:sz w:val="22"/>
-        </w:rPr>
-        <w:t>Pi,</w:t>
-      </w:r>
-      <w:r>
-        <w:rPr>
-          <w:sz w:val="22"/>
-        </w:rPr>
-        <w:t xml:space="preserve"> </w:t>
-      </w:r>
-      <w:r>
-        <w:rPr>
-          <w:sz w:val="22"/>
-        </w:rPr>
-        <w:t>UDP/TCP,</w:t>
-      </w:r>
-      <w:r>
-        <w:rPr>
-          <w:sz w:val="22"/>
-        </w:rPr>
-        <w:t xml:space="preserve"> </w:t>
-      </w:r>
-      <w:r>
-        <w:rPr>
-          <w:sz w:val="22"/>
-        </w:rPr>
-        <w:t>UART),</w:t>
-      </w:r>
-      <w:r>
-        <w:rPr>
-          <w:sz w:val="22"/>
-        </w:rPr>
-        <w:t xml:space="preserve"> </w:t>
-      </w:r>
-      <w:r>
-        <w:rPr>
-          <w:sz w:val="22"/>
-          <w:highlight w:val="yellow"/>
-        </w:rPr>
-        <w:t>Linux,</w:t>
-      </w:r>
-      <w:r>
-        <w:rPr>
-          <w:sz w:val="22"/>
-        </w:rPr>
-        <w:t xml:space="preserve"> </w:t>
-      </w:r>
-      <w:r>
-        <w:rPr>
-          <w:sz w:val="22"/>
-          <w:highlight w:val="yellow"/>
-        </w:rPr>
-        <w:t>Large-scale</w:t>
-      </w:r>
-      <w:r>
-        <w:rPr>
-          <w:sz w:val="22"/>
-        </w:rPr>
-        <w:t xml:space="preserve"> </w:t>
-      </w:r>
-      <w:r>
-        <w:rPr>
-          <w:sz w:val="22"/>
-          <w:highlight w:val="yellow"/>
-        </w:rPr>
-        <w:t>training</w:t>
-      </w:r>
-      <w:r>
-        <w:rPr>
-          <w:sz w:val="22"/>
-        </w:rPr>
-        <w:t xml:space="preserve"> </w:t>
-      </w:r>
-      <w:r>
-        <w:rPr>
-          <w:sz w:val="22"/>
-          <w:highlight w:val="yellow"/>
-        </w:rPr>
-        <w:t>pipelines</w:t>
+          <w:szCs w:val="22"/>
+          <w:rtl w:val="0"/>
+        </w:rPr>
+        <w:t>Programming &amp; Tools: Python, C++, PyTorch, Distributed Training, ROS2, Isaac Sim/Isaac Lab and MuJoCo (domain randomization, sim-to-real), Firmware &amp; Embedded Systems (Arduino, Raspberry Pi, UDP/TCP, UART), Linux</w:t>
       </w:r>
     </w:p>
     <w:p>
@@ -2983,216 +2879,10 @@
       <w:r>
         <w:rPr>
           <w:sz w:val="22"/>
-        </w:rPr>
-        <w:t>Team:</w:t>
-      </w:r>
-      <w:r>
-        <w:rPr>
-          <w:sz w:val="22"/>
-        </w:rPr>
-        <w:t xml:space="preserve"> </w:t>
-      </w:r>
-      <w:r>
-        <w:rPr>
-          <w:sz w:val="22"/>
-        </w:rPr>
-        <w:t>Product</w:t>
-      </w:r>
-      <w:r>
-        <w:rPr>
-          <w:sz w:val="22"/>
-        </w:rPr>
-        <w:t xml:space="preserve"> </w:t>
-      </w:r>
-      <w:r>
-        <w:rPr>
-          <w:sz w:val="22"/>
-        </w:rPr>
-        <w:t>and</w:t>
-      </w:r>
-      <w:r>
-        <w:rPr>
-          <w:sz w:val="22"/>
-        </w:rPr>
-        <w:t xml:space="preserve"> </w:t>
-      </w:r>
-      <w:r>
-        <w:rPr>
-          <w:sz w:val="22"/>
-        </w:rPr>
-        <w:t>Project</w:t>
-      </w:r>
-      <w:r>
-        <w:rPr>
-          <w:sz w:val="22"/>
-        </w:rPr>
-        <w:t xml:space="preserve"> </w:t>
-      </w:r>
-      <w:r>
-        <w:rPr>
-          <w:sz w:val="22"/>
-        </w:rPr>
-        <w:t>Management;</w:t>
-      </w:r>
-      <w:r>
-        <w:rPr>
-          <w:sz w:val="22"/>
-        </w:rPr>
-        <w:t xml:space="preserve"> </w:t>
-      </w:r>
-      <w:r>
-        <w:rPr>
-          <w:sz w:val="22"/>
-        </w:rPr>
-        <w:t>Technical</w:t>
-      </w:r>
-      <w:r>
-        <w:rPr>
-          <w:sz w:val="22"/>
-        </w:rPr>
-        <w:t xml:space="preserve"> </w:t>
-      </w:r>
-      <w:r>
-        <w:rPr>
-          <w:sz w:val="22"/>
-        </w:rPr>
-        <w:t>Leadership;</w:t>
-      </w:r>
-      <w:r>
-        <w:rPr>
-          <w:sz w:val="22"/>
-        </w:rPr>
-        <w:t xml:space="preserve"> </w:t>
-      </w:r>
-      <w:r>
-        <w:rPr>
-          <w:sz w:val="22"/>
-        </w:rPr>
-        <w:t>Team</w:t>
-      </w:r>
-      <w:r>
-        <w:rPr>
-          <w:sz w:val="22"/>
-        </w:rPr>
-        <w:t xml:space="preserve"> </w:t>
-      </w:r>
-      <w:r>
-        <w:rPr>
-          <w:sz w:val="22"/>
-        </w:rPr>
-        <w:t>Building</w:t>
-      </w:r>
-      <w:r>
-        <w:rPr>
-          <w:sz w:val="22"/>
-        </w:rPr>
-        <w:t xml:space="preserve"> </w:t>
-      </w:r>
-      <w:r>
-        <w:rPr>
-          <w:sz w:val="22"/>
-        </w:rPr>
-        <w:t>and</w:t>
-      </w:r>
-      <w:r>
-        <w:rPr>
-          <w:sz w:val="22"/>
-        </w:rPr>
-        <w:t xml:space="preserve"> </w:t>
-      </w:r>
-      <w:r>
-        <w:rPr>
-          <w:sz w:val="22"/>
-        </w:rPr>
-        <w:t>Hiring;</w:t>
-      </w:r>
-      <w:r>
-        <w:rPr>
-          <w:sz w:val="22"/>
-        </w:rPr>
-        <w:t xml:space="preserve"> </w:t>
-      </w:r>
-      <w:r>
-        <w:rPr>
-          <w:sz w:val="22"/>
-        </w:rPr>
-        <w:t>Technical</w:t>
-      </w:r>
-      <w:r>
-        <w:rPr>
-          <w:sz w:val="22"/>
-        </w:rPr>
-        <w:t xml:space="preserve"> </w:t>
-      </w:r>
-      <w:r>
-        <w:rPr>
-          <w:sz w:val="22"/>
-        </w:rPr>
-        <w:t>Communication</w:t>
-      </w:r>
-      <w:r>
-        <w:rPr>
-          <w:sz w:val="22"/>
-        </w:rPr>
-        <w:t xml:space="preserve"> </w:t>
-      </w:r>
-      <w:r>
-        <w:rPr>
-          <w:sz w:val="22"/>
-        </w:rPr>
-        <w:t>and</w:t>
-      </w:r>
-      <w:r>
-        <w:rPr>
-          <w:sz w:val="22"/>
-        </w:rPr>
-        <w:t xml:space="preserve"> </w:t>
-      </w:r>
-      <w:r>
-        <w:rPr>
-          <w:sz w:val="22"/>
-          <w:highlight w:val="yellow"/>
-        </w:rPr>
-        <w:t>Presentations;</w:t>
-      </w:r>
-      <w:r>
-        <w:rPr>
-          <w:sz w:val="22"/>
-        </w:rPr>
-        <w:t xml:space="preserve"> </w:t>
-      </w:r>
-      <w:r>
-        <w:rPr>
-          <w:sz w:val="22"/>
-          <w:highlight w:val="yellow"/>
-        </w:rPr>
-        <w:t>Cross-Functional</w:t>
-      </w:r>
-      <w:r>
-        <w:rPr>
-          <w:sz w:val="22"/>
-        </w:rPr>
-        <w:t xml:space="preserve"> </w:t>
-      </w:r>
-      <w:r>
-        <w:rPr>
-          <w:sz w:val="22"/>
-          <w:highlight w:val="yellow"/>
-        </w:rPr>
-        <w:t>Research</w:t>
-      </w:r>
-      <w:r>
-        <w:rPr>
-          <w:sz w:val="22"/>
-        </w:rPr>
-        <w:t xml:space="preserve"> </w:t>
-      </w:r>
-      <w:r>
-        <w:rPr>
-          <w:sz w:val="22"/>
-          <w:highlight w:val="yellow"/>
-        </w:rPr>
-        <w:t>Collaboration</w:t>
+          <w:szCs w:val="22"/>
+          <w:rtl w:val="0"/>
+        </w:rPr>
+        <w:t xml:space="preserve">Team: Product and Project Management; Technical Leadership; Team Building and Hiring; Technical Communication and Presentations</w:t>
       </w:r>
     </w:p>
     <w:p>

</xml_diff>